<commit_message>
Update notebook and report format to match step-by-step lab template and colab style
</commit_message>
<xml_diff>
--- a/Lab-05/ML LAB -5.docx
+++ b/Lab-05/ML LAB -5.docx
@@ -60,127 +60,195 @@
         <w:t>a) Load the dataset and display its structure.</w:t>
       </w:r>
     </w:p>
-    <w:p>
-      <w:pPr>
-        <w:pStyle w:val="IntenseQuote"/>
-      </w:pPr>
-      <w:r>
-        <w:rPr>
-          <w:rFonts w:ascii="Courier New" w:hAnsi="Courier New"/>
-          <w:sz w:val="20"/>
-        </w:rPr>
-        <w:t>import numpy as np</w:t>
-        <w:br/>
-        <w:t>import pandas as pd</w:t>
-        <w:br/>
-        <w:t>import matplotlib.pyplot as plt</w:t>
-        <w:br/>
-        <w:t>import seaborn as sns</w:t>
-        <w:br/>
-        <w:t>from sklearn.datasets import load_breast_cancer</w:t>
-        <w:br/>
-        <w:t>from sklearn.model_selection import train_test_split</w:t>
-        <w:br/>
-        <w:t>from sklearn.naive_bayes import GaussianNB</w:t>
-        <w:br/>
-        <w:t>from sklearn.tree import DecisionTreeClassifier, plot_tree</w:t>
-        <w:br/>
-        <w:t>from sklearn.metrics import accuracy_score, confusion_matrix, classification_report</w:t>
-        <w:br/>
-        <w:t>from sklearn.metrics import precision_recall_curve, roc_curve, auc</w:t>
-        <w:br/>
-        <w:br/>
-        <w:t># Load dataset and create dataframe</w:t>
-        <w:br/>
-        <w:t>data = load_breast_cancer()</w:t>
-        <w:br/>
-        <w:t>df = pd.DataFrame(data.data, columns=data.feature_names)</w:t>
-        <w:br/>
-        <w:t>df['target'] = data.target</w:t>
-        <w:br/>
-        <w:t>print(df.head())</w:t>
-        <w:br/>
-        <w:t>print(df.info())</w:t>
-      </w:r>
-    </w:p>
+    <w:tbl>
+      <w:tblPr>
+        <w:tblW w:type="auto" w:w="0"/>
+        <w:tblLook w:firstColumn="1" w:firstRow="1" w:lastColumn="0" w:lastRow="0" w:noHBand="0" w:noVBand="1" w:val="04A0"/>
+      </w:tblPr>
+      <w:tblGrid>
+        <w:gridCol w:w="8640"/>
+      </w:tblGrid>
+      <w:tr>
+        <w:tc>
+          <w:tcPr>
+            <w:tcW w:type="dxa" w:w="8640"/>
+            <w:shd w:val="clear" w:color="auto" w:fill="F7F7F7"/>
+          </w:tcPr>
+          <w:p>
+            <w:pPr>
+              <w:spacing w:before="120" w:after="120"/>
+            </w:pPr>
+            <w:r>
+              <w:rPr>
+                <w:rFonts w:ascii="Consolas" w:hAnsi="Consolas"/>
+                <w:sz w:val="19"/>
+              </w:rPr>
+              <w:t>import numpy as np</w:t>
+              <w:br/>
+              <w:t>import pandas as pd</w:t>
+              <w:br/>
+              <w:t>import matplotlib.pyplot as plt</w:t>
+              <w:br/>
+              <w:t>import seaborn as sns</w:t>
+              <w:br/>
+              <w:t>from sklearn.datasets import load_breast_cancer</w:t>
+              <w:br/>
+              <w:t>from sklearn.model_selection import train_test_split</w:t>
+              <w:br/>
+              <w:t>from sklearn.naive_bayes import GaussianNB</w:t>
+              <w:br/>
+              <w:t>from sklearn.tree import DecisionTreeClassifier, plot_tree</w:t>
+              <w:br/>
+              <w:t>from sklearn.metrics import accuracy_score, confusion_matrix, classification_report</w:t>
+              <w:br/>
+              <w:t>from sklearn.metrics import precision_recall_curve, roc_curve, auc</w:t>
+              <w:br/>
+              <w:br/>
+              <w:t># Load dataset and create dataframe</w:t>
+              <w:br/>
+              <w:t>data = load_breast_cancer()</w:t>
+              <w:br/>
+              <w:t>df = pd.DataFrame(data.data, columns=data.feature_names)</w:t>
+              <w:br/>
+              <w:t>df['target'] = data.target</w:t>
+              <w:br/>
+              <w:t>print(df.head())</w:t>
+              <w:br/>
+              <w:t>print(df.info())</w:t>
+            </w:r>
+          </w:p>
+        </w:tc>
+      </w:tr>
+    </w:tbl>
     <w:p>
       <w:r>
         <w:br/>
         <w:t>b) Split the dataset into training and testing sets (80:20).</w:t>
       </w:r>
     </w:p>
-    <w:p>
-      <w:pPr>
-        <w:pStyle w:val="IntenseQuote"/>
-      </w:pPr>
-      <w:r>
-        <w:rPr>
-          <w:rFonts w:ascii="Courier New" w:hAnsi="Courier New"/>
-          <w:sz w:val="20"/>
-        </w:rPr>
-        <w:t># Split dataset (80:20)</w:t>
-        <w:br/>
-        <w:t>X_train, X_test, y_train, y_test = train_test_split(</w:t>
-        <w:br/>
-        <w:t xml:space="preserve">    df.drop('target', axis=1), </w:t>
-        <w:br/>
-        <w:t xml:space="preserve">    df['target'], </w:t>
-        <w:br/>
-        <w:t xml:space="preserve">    test_size=0.2, </w:t>
-        <w:br/>
-        <w:t xml:space="preserve">    random_state=42</w:t>
-        <w:br/>
-        <w:t>)</w:t>
-        <w:br/>
-        <w:t>print(f"Training Data Shape: {X_train.shape}")</w:t>
-        <w:br/>
-        <w:t>print(f"Testing Data Shape: {X_test.shape}")</w:t>
-      </w:r>
-    </w:p>
+    <w:tbl>
+      <w:tblPr>
+        <w:tblW w:type="auto" w:w="0"/>
+        <w:tblLook w:firstColumn="1" w:firstRow="1" w:lastColumn="0" w:lastRow="0" w:noHBand="0" w:noVBand="1" w:val="04A0"/>
+      </w:tblPr>
+      <w:tblGrid>
+        <w:gridCol w:w="8640"/>
+      </w:tblGrid>
+      <w:tr>
+        <w:tc>
+          <w:tcPr>
+            <w:tcW w:type="dxa" w:w="8640"/>
+            <w:shd w:val="clear" w:color="auto" w:fill="F7F7F7"/>
+          </w:tcPr>
+          <w:p>
+            <w:pPr>
+              <w:spacing w:before="120" w:after="120"/>
+            </w:pPr>
+            <w:r>
+              <w:rPr>
+                <w:rFonts w:ascii="Consolas" w:hAnsi="Consolas"/>
+                <w:sz w:val="19"/>
+              </w:rPr>
+              <w:t># Split dataset (80:20)</w:t>
+              <w:br/>
+              <w:t>X_train, X_test, y_train, y_test = train_test_split(</w:t>
+              <w:br/>
+              <w:t xml:space="preserve">    df.drop('target', axis=1), </w:t>
+              <w:br/>
+              <w:t xml:space="preserve">    df['target'], </w:t>
+              <w:br/>
+              <w:t xml:space="preserve">    test_size=0.2, </w:t>
+              <w:br/>
+              <w:t xml:space="preserve">    random_state=42</w:t>
+              <w:br/>
+              <w:t>)</w:t>
+              <w:br/>
+              <w:t>print(f"Training Data Shape: {X_train.shape}")</w:t>
+              <w:br/>
+              <w:t>print(f"Testing Data Shape: {X_test.shape}")</w:t>
+            </w:r>
+          </w:p>
+        </w:tc>
+      </w:tr>
+    </w:tbl>
     <w:p>
       <w:r>
         <w:br/>
         <w:t>c) Train a Naïve Bayes classifier.</w:t>
       </w:r>
     </w:p>
-    <w:p>
-      <w:pPr>
-        <w:pStyle w:val="IntenseQuote"/>
-      </w:pPr>
-      <w:r>
-        <w:rPr>
-          <w:rFonts w:ascii="Courier New" w:hAnsi="Courier New"/>
-          <w:sz w:val="20"/>
-        </w:rPr>
-        <w:t># Train Naïve Bayes</w:t>
-        <w:br/>
-        <w:t>nb_model = GaussianNB()</w:t>
-        <w:br/>
-        <w:t>nb_model.fit(X_train, y_train)</w:t>
-      </w:r>
-    </w:p>
+    <w:tbl>
+      <w:tblPr>
+        <w:tblW w:type="auto" w:w="0"/>
+        <w:tblLook w:firstColumn="1" w:firstRow="1" w:lastColumn="0" w:lastRow="0" w:noHBand="0" w:noVBand="1" w:val="04A0"/>
+      </w:tblPr>
+      <w:tblGrid>
+        <w:gridCol w:w="8640"/>
+      </w:tblGrid>
+      <w:tr>
+        <w:tc>
+          <w:tcPr>
+            <w:tcW w:type="dxa" w:w="8640"/>
+            <w:shd w:val="clear" w:color="auto" w:fill="F7F7F7"/>
+          </w:tcPr>
+          <w:p>
+            <w:pPr>
+              <w:spacing w:before="120" w:after="120"/>
+            </w:pPr>
+            <w:r>
+              <w:rPr>
+                <w:rFonts w:ascii="Consolas" w:hAnsi="Consolas"/>
+                <w:sz w:val="19"/>
+              </w:rPr>
+              <w:t># Train Naïve Bayes</w:t>
+              <w:br/>
+              <w:t>nb_model = GaussianNB()</w:t>
+              <w:br/>
+              <w:t>nb_model.fit(X_train, y_train)</w:t>
+            </w:r>
+          </w:p>
+        </w:tc>
+      </w:tr>
+    </w:tbl>
     <w:p>
       <w:r>
         <w:br/>
         <w:t>d) Predict class labels for the test dataset.</w:t>
       </w:r>
     </w:p>
-    <w:p>
-      <w:pPr>
-        <w:pStyle w:val="IntenseQuote"/>
-      </w:pPr>
-      <w:r>
-        <w:rPr>
-          <w:rFonts w:ascii="Courier New" w:hAnsi="Courier New"/>
-          <w:sz w:val="20"/>
-        </w:rPr>
-        <w:t># Predict class labels</w:t>
-        <w:br/>
-        <w:t>nb_pred = nb_model.predict(X_test)</w:t>
-        <w:br/>
-        <w:t>nb_pred_proba = nb_model.predict_proba(X_test)[:, 1]</w:t>
-      </w:r>
-    </w:p>
+    <w:tbl>
+      <w:tblPr>
+        <w:tblW w:type="auto" w:w="0"/>
+        <w:tblLook w:firstColumn="1" w:firstRow="1" w:lastColumn="0" w:lastRow="0" w:noHBand="0" w:noVBand="1" w:val="04A0"/>
+      </w:tblPr>
+      <w:tblGrid>
+        <w:gridCol w:w="8640"/>
+      </w:tblGrid>
+      <w:tr>
+        <w:tc>
+          <w:tcPr>
+            <w:tcW w:type="dxa" w:w="8640"/>
+            <w:shd w:val="clear" w:color="auto" w:fill="F7F7F7"/>
+          </w:tcPr>
+          <w:p>
+            <w:pPr>
+              <w:spacing w:before="120" w:after="120"/>
+            </w:pPr>
+            <w:r>
+              <w:rPr>
+                <w:rFonts w:ascii="Consolas" w:hAnsi="Consolas"/>
+                <w:sz w:val="19"/>
+              </w:rPr>
+              <w:t># Predict class labels</w:t>
+              <w:br/>
+              <w:t>nb_pred = nb_model.predict(X_test)</w:t>
+              <w:br/>
+              <w:t>nb_pred_proba = nb_model.predict_proba(X_test)[:, 1]</w:t>
+            </w:r>
+          </w:p>
+        </w:tc>
+      </w:tr>
+    </w:tbl>
     <w:p>
       <w:r>
         <w:br/>
@@ -199,46 +267,63 @@
         <w:t>Also display the output and plots.</w:t>
       </w:r>
     </w:p>
-    <w:p>
-      <w:pPr>
-        <w:pStyle w:val="IntenseQuote"/>
-      </w:pPr>
-      <w:r>
-        <w:rPr>
-          <w:rFonts w:ascii="Courier New" w:hAnsi="Courier New"/>
-          <w:sz w:val="20"/>
-        </w:rPr>
-        <w:t># Evaluate</w:t>
-        <w:br/>
-        <w:t>nb_acc_train = accuracy_score(y_train, nb_model.predict(X_train))</w:t>
-        <w:br/>
-        <w:t>nb_acc_test = accuracy_score(y_test, nb_pred)</w:t>
-        <w:br/>
-        <w:br/>
-        <w:t>print(f"Naïve Bayes Accuracy: {nb_acc_test:.4f}")</w:t>
-        <w:br/>
-        <w:t>print("\nConfusion Matrix:\n", confusion_matrix(y_test, nb_pred))</w:t>
-        <w:br/>
-        <w:t>print("\nClassification Report:\n", classification_report(y_test, nb_pred, target_names=data.target_names))</w:t>
-        <w:br/>
-        <w:br/>
-        <w:t># Precision Recall Curve</w:t>
-        <w:br/>
-        <w:t>precision, recall, _ = precision_recall_curve(y_test, nb_pred_proba)</w:t>
-        <w:br/>
-        <w:t>plt.figure(figsize=(8,6))</w:t>
-        <w:br/>
-        <w:t>plt.plot(recall, precision, marker='.')</w:t>
-        <w:br/>
-        <w:t>plt.title('Naïve Bayes Precision-Recall Curve')</w:t>
-        <w:br/>
-        <w:t>plt.xlabel('Recall')</w:t>
-        <w:br/>
-        <w:t>plt.ylabel('Precision')</w:t>
-        <w:br/>
-        <w:t>plt.show()</w:t>
-      </w:r>
-    </w:p>
+    <w:tbl>
+      <w:tblPr>
+        <w:tblW w:type="auto" w:w="0"/>
+        <w:tblLook w:firstColumn="1" w:firstRow="1" w:lastColumn="0" w:lastRow="0" w:noHBand="0" w:noVBand="1" w:val="04A0"/>
+      </w:tblPr>
+      <w:tblGrid>
+        <w:gridCol w:w="8640"/>
+      </w:tblGrid>
+      <w:tr>
+        <w:tc>
+          <w:tcPr>
+            <w:tcW w:type="dxa" w:w="8640"/>
+            <w:shd w:val="clear" w:color="auto" w:fill="F7F7F7"/>
+          </w:tcPr>
+          <w:p>
+            <w:pPr>
+              <w:spacing w:before="120" w:after="120"/>
+            </w:pPr>
+            <w:r>
+              <w:rPr>
+                <w:rFonts w:ascii="Consolas" w:hAnsi="Consolas"/>
+                <w:sz w:val="19"/>
+              </w:rPr>
+              <w:t># Evaluate</w:t>
+              <w:br/>
+              <w:t>nb_acc_train = accuracy_score(y_train, nb_model.predict(X_train))</w:t>
+              <w:br/>
+              <w:t>nb_acc_test = accuracy_score(y_test, nb_pred)</w:t>
+              <w:br/>
+              <w:br/>
+              <w:t>print(f"Naïve Bayes Accuracy: {nb_acc_test:.4f}")</w:t>
+              <w:br/>
+              <w:t>print("\nConfusion Matrix:\n", confusion_matrix(y_test, nb_pred))</w:t>
+              <w:br/>
+              <w:t>print("\nClassification Report:\n", classification_report(y_test, nb_pred, target_names=data.target_names))</w:t>
+              <w:br/>
+              <w:br/>
+              <w:t># Precision Recall Curve</w:t>
+              <w:br/>
+              <w:t>precision, recall, _ = precision_recall_curve(y_test, nb_pred_proba)</w:t>
+              <w:br/>
+              <w:t>plt.figure()</w:t>
+              <w:br/>
+              <w:t>plt.plot(recall, precision, marker='.')</w:t>
+              <w:br/>
+              <w:t>plt.title('Naïve Bayes Precision-Recall Curve')</w:t>
+              <w:br/>
+              <w:t>plt.xlabel('Recall')</w:t>
+              <w:br/>
+              <w:t>plt.ylabel('Precision')</w:t>
+              <w:br/>
+              <w:t>plt.show()</w:t>
+            </w:r>
+          </w:p>
+        </w:tc>
+      </w:tr>
+    </w:tbl>
     <w:p>
       <w:r>
         <w:t>------------------------------------------------</w:t>
@@ -258,86 +343,154 @@
         <w:t>a) Load the dataset and prepare features and labels.</w:t>
       </w:r>
     </w:p>
-    <w:p>
-      <w:pPr>
-        <w:pStyle w:val="IntenseQuote"/>
-      </w:pPr>
-      <w:r>
-        <w:rPr>
-          <w:rFonts w:ascii="Courier New" w:hAnsi="Courier New"/>
-          <w:sz w:val="20"/>
-        </w:rPr>
-        <w:t># Already loaded as X and y above, but we can state prep is done</w:t>
-        <w:br/>
-        <w:t># X = df.drop('target', axis=1)</w:t>
-        <w:br/>
-        <w:t># y = df['target']</w:t>
-      </w:r>
-    </w:p>
+    <w:tbl>
+      <w:tblPr>
+        <w:tblW w:type="auto" w:w="0"/>
+        <w:tblLook w:firstColumn="1" w:firstRow="1" w:lastColumn="0" w:lastRow="0" w:noHBand="0" w:noVBand="1" w:val="04A0"/>
+      </w:tblPr>
+      <w:tblGrid>
+        <w:gridCol w:w="8640"/>
+      </w:tblGrid>
+      <w:tr>
+        <w:tc>
+          <w:tcPr>
+            <w:tcW w:type="dxa" w:w="8640"/>
+            <w:shd w:val="clear" w:color="auto" w:fill="F7F7F7"/>
+          </w:tcPr>
+          <w:p>
+            <w:pPr>
+              <w:spacing w:before="120" w:after="120"/>
+            </w:pPr>
+            <w:r>
+              <w:rPr>
+                <w:rFonts w:ascii="Consolas" w:hAnsi="Consolas"/>
+                <w:sz w:val="19"/>
+              </w:rPr>
+              <w:t># Already loaded as X and y above, but we can state prep is done</w:t>
+              <w:br/>
+              <w:t># X = df.drop('target', axis=1)</w:t>
+              <w:br/>
+              <w:t># y = df['target']</w:t>
+            </w:r>
+          </w:p>
+        </w:tc>
+      </w:tr>
+    </w:tbl>
     <w:p>
       <w:r>
         <w:br/>
         <w:t>b) Split the dataset into training and testing sets.</w:t>
       </w:r>
     </w:p>
-    <w:p>
-      <w:pPr>
-        <w:pStyle w:val="IntenseQuote"/>
-      </w:pPr>
-      <w:r>
-        <w:rPr>
-          <w:rFonts w:ascii="Courier New" w:hAnsi="Courier New"/>
-          <w:sz w:val="20"/>
-        </w:rPr>
-        <w:t># We will reuse the same 80:20 split to ensure fair comparison</w:t>
-        <w:br/>
-        <w:t># X_train, X_test, y_train, y_test computed previously</w:t>
-      </w:r>
-    </w:p>
+    <w:tbl>
+      <w:tblPr>
+        <w:tblW w:type="auto" w:w="0"/>
+        <w:tblLook w:firstColumn="1" w:firstRow="1" w:lastColumn="0" w:lastRow="0" w:noHBand="0" w:noVBand="1" w:val="04A0"/>
+      </w:tblPr>
+      <w:tblGrid>
+        <w:gridCol w:w="8640"/>
+      </w:tblGrid>
+      <w:tr>
+        <w:tc>
+          <w:tcPr>
+            <w:tcW w:type="dxa" w:w="8640"/>
+            <w:shd w:val="clear" w:color="auto" w:fill="F7F7F7"/>
+          </w:tcPr>
+          <w:p>
+            <w:pPr>
+              <w:spacing w:before="120" w:after="120"/>
+            </w:pPr>
+            <w:r>
+              <w:rPr>
+                <w:rFonts w:ascii="Consolas" w:hAnsi="Consolas"/>
+                <w:sz w:val="19"/>
+              </w:rPr>
+              <w:t># We will reuse the same 80:20 split to ensure fair comparison</w:t>
+              <w:br/>
+              <w:t># X_train, X_test, y_train, y_test computed previously</w:t>
+            </w:r>
+          </w:p>
+        </w:tc>
+      </w:tr>
+    </w:tbl>
     <w:p>
       <w:r>
         <w:br/>
         <w:t>c) Train the Decision Tree classifier.</w:t>
       </w:r>
     </w:p>
-    <w:p>
-      <w:pPr>
-        <w:pStyle w:val="IntenseQuote"/>
-      </w:pPr>
-      <w:r>
-        <w:rPr>
-          <w:rFonts w:ascii="Courier New" w:hAnsi="Courier New"/>
-          <w:sz w:val="20"/>
-        </w:rPr>
-        <w:t># Train Decision Tree</w:t>
-        <w:br/>
-        <w:t>dt_model = DecisionTreeClassifier(random_state=42)</w:t>
-        <w:br/>
-        <w:t>dt_model.fit(X_train, y_train)</w:t>
-      </w:r>
-    </w:p>
+    <w:tbl>
+      <w:tblPr>
+        <w:tblW w:type="auto" w:w="0"/>
+        <w:tblLook w:firstColumn="1" w:firstRow="1" w:lastColumn="0" w:lastRow="0" w:noHBand="0" w:noVBand="1" w:val="04A0"/>
+      </w:tblPr>
+      <w:tblGrid>
+        <w:gridCol w:w="8640"/>
+      </w:tblGrid>
+      <w:tr>
+        <w:tc>
+          <w:tcPr>
+            <w:tcW w:type="dxa" w:w="8640"/>
+            <w:shd w:val="clear" w:color="auto" w:fill="F7F7F7"/>
+          </w:tcPr>
+          <w:p>
+            <w:pPr>
+              <w:spacing w:before="120" w:after="120"/>
+            </w:pPr>
+            <w:r>
+              <w:rPr>
+                <w:rFonts w:ascii="Consolas" w:hAnsi="Consolas"/>
+                <w:sz w:val="19"/>
+              </w:rPr>
+              <w:t># Train Decision Tree</w:t>
+              <w:br/>
+              <w:t>dt_model = DecisionTreeClassifier(random_state=42)</w:t>
+              <w:br/>
+              <w:t>dt_model.fit(X_train, y_train)</w:t>
+            </w:r>
+          </w:p>
+        </w:tc>
+      </w:tr>
+    </w:tbl>
     <w:p>
       <w:r>
         <w:br/>
         <w:t>d) Predict the test data labels.</w:t>
       </w:r>
     </w:p>
-    <w:p>
-      <w:pPr>
-        <w:pStyle w:val="IntenseQuote"/>
-      </w:pPr>
-      <w:r>
-        <w:rPr>
-          <w:rFonts w:ascii="Courier New" w:hAnsi="Courier New"/>
-          <w:sz w:val="20"/>
-        </w:rPr>
-        <w:t># Predict class labels</w:t>
-        <w:br/>
-        <w:t>dt_pred = dt_model.predict(X_test)</w:t>
-        <w:br/>
-        <w:t>dt_pred_proba = dt_model.predict_proba(X_test)[:, 1]</w:t>
-      </w:r>
-    </w:p>
+    <w:tbl>
+      <w:tblPr>
+        <w:tblW w:type="auto" w:w="0"/>
+        <w:tblLook w:firstColumn="1" w:firstRow="1" w:lastColumn="0" w:lastRow="0" w:noHBand="0" w:noVBand="1" w:val="04A0"/>
+      </w:tblPr>
+      <w:tblGrid>
+        <w:gridCol w:w="8640"/>
+      </w:tblGrid>
+      <w:tr>
+        <w:tc>
+          <w:tcPr>
+            <w:tcW w:type="dxa" w:w="8640"/>
+            <w:shd w:val="clear" w:color="auto" w:fill="F7F7F7"/>
+          </w:tcPr>
+          <w:p>
+            <w:pPr>
+              <w:spacing w:before="120" w:after="120"/>
+            </w:pPr>
+            <w:r>
+              <w:rPr>
+                <w:rFonts w:ascii="Consolas" w:hAnsi="Consolas"/>
+                <w:sz w:val="19"/>
+              </w:rPr>
+              <w:t># Predict class labels</w:t>
+              <w:br/>
+              <w:t>dt_pred = dt_model.predict(X_test)</w:t>
+              <w:br/>
+              <w:t>dt_pred_proba = dt_model.predict_proba(X_test)[:, 1]</w:t>
+            </w:r>
+          </w:p>
+        </w:tc>
+      </w:tr>
+    </w:tbl>
     <w:p>
       <w:r>
         <w:br/>
@@ -353,86 +506,120 @@
         <w:t>• Precision Recall Curve</w:t>
       </w:r>
     </w:p>
-    <w:p>
-      <w:pPr>
-        <w:pStyle w:val="IntenseQuote"/>
-      </w:pPr>
-      <w:r>
-        <w:rPr>
-          <w:rFonts w:ascii="Courier New" w:hAnsi="Courier New"/>
-          <w:sz w:val="20"/>
-        </w:rPr>
-        <w:t># Evaluate</w:t>
-        <w:br/>
-        <w:t>dt_acc_train = accuracy_score(y_train, dt_model.predict(X_train))</w:t>
-        <w:br/>
-        <w:t>dt_acc_test = accuracy_score(y_test, dt_pred)</w:t>
-        <w:br/>
-        <w:br/>
-        <w:t>print(f"Decision Tree Accuracy: {dt_acc_test:.4f}")</w:t>
-        <w:br/>
-        <w:t>print("\nConfusion Matrix:\n", confusion_matrix(y_test, dt_pred))</w:t>
-        <w:br/>
-        <w:t>print("\nClassification Report:\n", classification_report(y_test, dt_pred, target_names=data.target_names))</w:t>
-        <w:br/>
-        <w:br/>
-        <w:t># Precision Recall Curve</w:t>
-        <w:br/>
-        <w:t>precision_dt, recall_dt, _ = precision_recall_curve(y_test, dt_pred_proba)</w:t>
-        <w:br/>
-        <w:t>plt.figure(figsize=(8,6))</w:t>
-        <w:br/>
-        <w:t>plt.plot(recall_dt, precision_dt, marker='.')</w:t>
-        <w:br/>
-        <w:t>plt.title('Decision Tree Precision-Recall Curve')</w:t>
-        <w:br/>
-        <w:t>plt.xlabel('Recall')</w:t>
-        <w:br/>
-        <w:t>plt.ylabel('Precision')</w:t>
-        <w:br/>
-        <w:t>plt.show()</w:t>
-      </w:r>
-    </w:p>
+    <w:tbl>
+      <w:tblPr>
+        <w:tblW w:type="auto" w:w="0"/>
+        <w:tblLook w:firstColumn="1" w:firstRow="1" w:lastColumn="0" w:lastRow="0" w:noHBand="0" w:noVBand="1" w:val="04A0"/>
+      </w:tblPr>
+      <w:tblGrid>
+        <w:gridCol w:w="8640"/>
+      </w:tblGrid>
+      <w:tr>
+        <w:tc>
+          <w:tcPr>
+            <w:tcW w:type="dxa" w:w="8640"/>
+            <w:shd w:val="clear" w:color="auto" w:fill="F7F7F7"/>
+          </w:tcPr>
+          <w:p>
+            <w:pPr>
+              <w:spacing w:before="120" w:after="120"/>
+            </w:pPr>
+            <w:r>
+              <w:rPr>
+                <w:rFonts w:ascii="Consolas" w:hAnsi="Consolas"/>
+                <w:sz w:val="19"/>
+              </w:rPr>
+              <w:t># Evaluate</w:t>
+              <w:br/>
+              <w:t>dt_acc_train = accuracy_score(y_train, dt_model.predict(X_train))</w:t>
+              <w:br/>
+              <w:t>dt_acc_test = accuracy_score(y_test, dt_pred)</w:t>
+              <w:br/>
+              <w:br/>
+              <w:t>print(f"Decision Tree Accuracy: {dt_acc_test:.4f}")</w:t>
+              <w:br/>
+              <w:t>print("\nConfusion Matrix:\n", confusion_matrix(y_test, dt_pred))</w:t>
+              <w:br/>
+              <w:t>print("\nClassification Report:\n", classification_report(y_test, dt_pred, target_names=data.target_names))</w:t>
+              <w:br/>
+              <w:br/>
+              <w:t># Precision Recall Curve</w:t>
+              <w:br/>
+              <w:t>precision_dt, recall_dt, _ = precision_recall_curve(y_test, dt_pred_proba)</w:t>
+              <w:br/>
+              <w:t>plt.figure()</w:t>
+              <w:br/>
+              <w:t>plt.plot(recall_dt, precision_dt, marker='.')</w:t>
+              <w:br/>
+              <w:t>plt.title('Decision Tree Precision-Recall Curve')</w:t>
+              <w:br/>
+              <w:t>plt.xlabel('Recall')</w:t>
+              <w:br/>
+              <w:t>plt.ylabel('Precision')</w:t>
+              <w:br/>
+              <w:t>plt.show()</w:t>
+            </w:r>
+          </w:p>
+        </w:tc>
+      </w:tr>
+    </w:tbl>
     <w:p>
       <w:r>
         <w:br/>
         <w:t>f) Visualize the decision tree.</w:t>
       </w:r>
     </w:p>
-    <w:p>
-      <w:pPr>
-        <w:pStyle w:val="IntenseQuote"/>
-      </w:pPr>
-      <w:r>
-        <w:rPr>
-          <w:rFonts w:ascii="Courier New" w:hAnsi="Courier New"/>
-          <w:sz w:val="20"/>
-        </w:rPr>
-        <w:t># Visualize tree</w:t>
-        <w:br/>
-        <w:t>plt.figure(figsize=(20, 10))</w:t>
-        <w:br/>
-        <w:t>plot_tree(</w:t>
-        <w:br/>
-        <w:t xml:space="preserve">    dt_model, </w:t>
-        <w:br/>
-        <w:t xml:space="preserve">    filled=True, </w:t>
-        <w:br/>
-        <w:t xml:space="preserve">    feature_names=list(data.feature_names), </w:t>
-        <w:br/>
-        <w:t xml:space="preserve">    class_names=list(data.target_names), </w:t>
-        <w:br/>
-        <w:t xml:space="preserve">    max_depth=3, </w:t>
-        <w:br/>
-        <w:t xml:space="preserve">    fontsize=10</w:t>
-        <w:br/>
-        <w:t>)</w:t>
-        <w:br/>
-        <w:t>plt.title("Decision Tree Visualization")</w:t>
-        <w:br/>
-        <w:t>plt.show()</w:t>
-      </w:r>
-    </w:p>
+    <w:tbl>
+      <w:tblPr>
+        <w:tblW w:type="auto" w:w="0"/>
+        <w:tblLook w:firstColumn="1" w:firstRow="1" w:lastColumn="0" w:lastRow="0" w:noHBand="0" w:noVBand="1" w:val="04A0"/>
+      </w:tblPr>
+      <w:tblGrid>
+        <w:gridCol w:w="8640"/>
+      </w:tblGrid>
+      <w:tr>
+        <w:tc>
+          <w:tcPr>
+            <w:tcW w:type="dxa" w:w="8640"/>
+            <w:shd w:val="clear" w:color="auto" w:fill="F7F7F7"/>
+          </w:tcPr>
+          <w:p>
+            <w:pPr>
+              <w:spacing w:before="120" w:after="120"/>
+            </w:pPr>
+            <w:r>
+              <w:rPr>
+                <w:rFonts w:ascii="Consolas" w:hAnsi="Consolas"/>
+                <w:sz w:val="19"/>
+              </w:rPr>
+              <w:t># Visualize tree</w:t>
+              <w:br/>
+              <w:t>plt.figure(figsize=(20, 10))</w:t>
+              <w:br/>
+              <w:t>plot_tree(</w:t>
+              <w:br/>
+              <w:t xml:space="preserve">    dt_model, </w:t>
+              <w:br/>
+              <w:t xml:space="preserve">    filled=True, </w:t>
+              <w:br/>
+              <w:t xml:space="preserve">    feature_names=list(data.feature_names), </w:t>
+              <w:br/>
+              <w:t xml:space="preserve">    class_names=list(data.target_names), </w:t>
+              <w:br/>
+              <w:t xml:space="preserve">    max_depth=3, </w:t>
+              <w:br/>
+              <w:t xml:space="preserve">    fontsize=10</w:t>
+              <w:br/>
+              <w:t>)</w:t>
+              <w:br/>
+              <w:t>plt.title("Decision Tree Visualization")</w:t>
+              <w:br/>
+              <w:t>plt.show()</w:t>
+            </w:r>
+          </w:p>
+        </w:tc>
+      </w:tr>
+    </w:tbl>
     <w:p>
       <w:r>
         <w:t>------------------------------------------------</w:t>
@@ -458,139 +645,190 @@
         <w:t>1) Bar chart comparing training and testing accuracy</w:t>
       </w:r>
     </w:p>
-    <w:p>
-      <w:pPr>
-        <w:pStyle w:val="IntenseQuote"/>
-      </w:pPr>
-      <w:r>
-        <w:rPr>
-          <w:rFonts w:ascii="Courier New" w:hAnsi="Courier New"/>
-          <w:sz w:val="20"/>
-        </w:rPr>
-        <w:t># 1. Accuracy Comparison</w:t>
-        <w:br/>
-        <w:t>labels = ['Naïve Bayes', 'Decision Tree']</w:t>
-        <w:br/>
-        <w:t>train_acc = [nb_acc_train, dt_acc_train]</w:t>
-        <w:br/>
-        <w:t>test_acc = [nb_acc_test, dt_acc_test]</w:t>
-        <w:br/>
-        <w:br/>
-        <w:t>x = np.arange(len(labels))</w:t>
-        <w:br/>
-        <w:t>width = 0.35</w:t>
-        <w:br/>
-        <w:br/>
-        <w:t>fig, ax = plt.subplots(figsize=(8, 6))</w:t>
-        <w:br/>
-        <w:t>rects1 = ax.bar(x - width/2, train_acc, width, label='Training Accuracy')</w:t>
-        <w:br/>
-        <w:t>rects2 = ax.bar(x + width/2, test_acc, width, label='Testing Accuracy')</w:t>
-        <w:br/>
-        <w:br/>
-        <w:t>ax.set_ylabel('Accuracy')</w:t>
-        <w:br/>
-        <w:t>ax.set_title('Training vs Testing Accuracy Comparison')</w:t>
-        <w:br/>
-        <w:t>ax.set_xticks(x)</w:t>
-        <w:br/>
-        <w:t>ax.set_xticklabels(labels)</w:t>
-        <w:br/>
-        <w:t>ax.legend(loc='lower left')</w:t>
-        <w:br/>
-        <w:t>plt.show()</w:t>
-      </w:r>
-    </w:p>
+    <w:tbl>
+      <w:tblPr>
+        <w:tblW w:type="auto" w:w="0"/>
+        <w:tblLook w:firstColumn="1" w:firstRow="1" w:lastColumn="0" w:lastRow="0" w:noHBand="0" w:noVBand="1" w:val="04A0"/>
+      </w:tblPr>
+      <w:tblGrid>
+        <w:gridCol w:w="8640"/>
+      </w:tblGrid>
+      <w:tr>
+        <w:tc>
+          <w:tcPr>
+            <w:tcW w:type="dxa" w:w="8640"/>
+            <w:shd w:val="clear" w:color="auto" w:fill="F7F7F7"/>
+          </w:tcPr>
+          <w:p>
+            <w:pPr>
+              <w:spacing w:before="120" w:after="120"/>
+            </w:pPr>
+            <w:r>
+              <w:rPr>
+                <w:rFonts w:ascii="Consolas" w:hAnsi="Consolas"/>
+                <w:sz w:val="19"/>
+              </w:rPr>
+              <w:t># 1. Accuracy Comparison</w:t>
+              <w:br/>
+              <w:t>labels = ['Naïve Bayes', 'Decision Tree']</w:t>
+              <w:br/>
+              <w:t>train_acc = [nb_acc_train, dt_acc_train]</w:t>
+              <w:br/>
+              <w:t>test_acc = [nb_acc_test, dt_acc_test]</w:t>
+              <w:br/>
+              <w:br/>
+              <w:t>x = np.arange(len(labels))</w:t>
+              <w:br/>
+              <w:t>width = 0.35</w:t>
+              <w:br/>
+              <w:br/>
+              <w:t>fig, ax = plt.subplots(figsize=(8, 6))</w:t>
+              <w:br/>
+              <w:t>rects1 = ax.bar(x - width/2, train_acc, width, label='Training Accuracy')</w:t>
+              <w:br/>
+              <w:t>rects2 = ax.bar(x + width/2, test_acc, width, label='Testing Accuracy')</w:t>
+              <w:br/>
+              <w:br/>
+              <w:t>ax.set_ylabel('Accuracy')</w:t>
+              <w:br/>
+              <w:t>ax.set_title('Training vs Testing Accuracy Comparison')</w:t>
+              <w:br/>
+              <w:t>ax.set_xticks(x)</w:t>
+              <w:br/>
+              <w:t>ax.set_xticklabels(labels)</w:t>
+              <w:br/>
+              <w:t>ax.legend(loc='lower left')</w:t>
+              <w:br/>
+              <w:t>plt.show()</w:t>
+            </w:r>
+          </w:p>
+        </w:tc>
+      </w:tr>
+    </w:tbl>
     <w:p>
       <w:r>
         <w:br/>
         <w:t>2) ROC curve comparison</w:t>
       </w:r>
     </w:p>
-    <w:p>
-      <w:pPr>
-        <w:pStyle w:val="IntenseQuote"/>
-      </w:pPr>
-      <w:r>
-        <w:rPr>
-          <w:rFonts w:ascii="Courier New" w:hAnsi="Courier New"/>
-          <w:sz w:val="20"/>
-        </w:rPr>
-        <w:t># 2. ROC Curve</w:t>
-        <w:br/>
-        <w:t>fpr_nb, tpr_nb, _ = roc_curve(y_test, nb_pred_proba)</w:t>
-        <w:br/>
-        <w:t>roc_auc_nb = auc(fpr_nb, tpr_nb)</w:t>
-        <w:br/>
-        <w:br/>
-        <w:t>fpr_dt, tpr_dt, _ = roc_curve(y_test, dt_pred_proba)</w:t>
-        <w:br/>
-        <w:t>roc_auc_dt = auc(fpr_dt, tpr_dt)</w:t>
-        <w:br/>
-        <w:br/>
-        <w:t>plt.figure(figsize=(8, 6))</w:t>
-        <w:br/>
-        <w:t>plt.plot(fpr_nb, tpr_nb, label=f'Naïve Bayes (AUC = {roc_auc_nb:.2f})')</w:t>
-        <w:br/>
-        <w:t>plt.plot(fpr_dt, tpr_dt, label=f'Decision Tree (AUC = {roc_auc_dt:.2f})')</w:t>
-        <w:br/>
-        <w:t>plt.plot([0, 1], [0, 1], 'k--')</w:t>
-        <w:br/>
-        <w:t>plt.xlabel('False Positive Rate')</w:t>
-        <w:br/>
-        <w:t>plt.ylabel('True Positive Rate')</w:t>
-        <w:br/>
-        <w:t>plt.title('ROC Curve Comparison')</w:t>
-        <w:br/>
-        <w:t>plt.legend(loc='lower right')</w:t>
-        <w:br/>
-        <w:t>plt.show()</w:t>
-      </w:r>
-    </w:p>
+    <w:tbl>
+      <w:tblPr>
+        <w:tblW w:type="auto" w:w="0"/>
+        <w:tblLook w:firstColumn="1" w:firstRow="1" w:lastColumn="0" w:lastRow="0" w:noHBand="0" w:noVBand="1" w:val="04A0"/>
+      </w:tblPr>
+      <w:tblGrid>
+        <w:gridCol w:w="8640"/>
+      </w:tblGrid>
+      <w:tr>
+        <w:tc>
+          <w:tcPr>
+            <w:tcW w:type="dxa" w:w="8640"/>
+            <w:shd w:val="clear" w:color="auto" w:fill="F7F7F7"/>
+          </w:tcPr>
+          <w:p>
+            <w:pPr>
+              <w:spacing w:before="120" w:after="120"/>
+            </w:pPr>
+            <w:r>
+              <w:rPr>
+                <w:rFonts w:ascii="Consolas" w:hAnsi="Consolas"/>
+                <w:sz w:val="19"/>
+              </w:rPr>
+              <w:t># 2. ROC Curve</w:t>
+              <w:br/>
+              <w:t>fpr_nb, tpr_nb, _ = roc_curve(y_test, nb_pred_proba)</w:t>
+              <w:br/>
+              <w:t>roc_auc_nb = auc(fpr_nb, tpr_nb)</w:t>
+              <w:br/>
+              <w:br/>
+              <w:t>fpr_dt, tpr_dt, _ = roc_curve(y_test, dt_pred_proba)</w:t>
+              <w:br/>
+              <w:t>roc_auc_dt = auc(fpr_dt, tpr_dt)</w:t>
+              <w:br/>
+              <w:br/>
+              <w:t>plt.figure(figsize=(8, 6))</w:t>
+              <w:br/>
+              <w:t>plt.plot(fpr_nb, tpr_nb, label=f'Naïve Bayes (AUC = {roc_auc_nb:.2f})')</w:t>
+              <w:br/>
+              <w:t>plt.plot(fpr_dt, tpr_dt, label=f'Decision Tree (AUC = {roc_auc_dt:.2f})')</w:t>
+              <w:br/>
+              <w:t>plt.plot([0, 1], [0, 1], 'k--')</w:t>
+              <w:br/>
+              <w:t>plt.xlabel('False Positive Rate')</w:t>
+              <w:br/>
+              <w:t>plt.ylabel('True Positive Rate')</w:t>
+              <w:br/>
+              <w:t>plt.title('ROC Curve Comparison')</w:t>
+              <w:br/>
+              <w:t>plt.legend(loc='lower right')</w:t>
+              <w:br/>
+              <w:t>plt.show()</w:t>
+            </w:r>
+          </w:p>
+        </w:tc>
+      </w:tr>
+    </w:tbl>
     <w:p>
       <w:r>
         <w:br/>
         <w:t>3) Confusion Matrix heatmaps for both models</w:t>
       </w:r>
     </w:p>
-    <w:p>
-      <w:pPr>
-        <w:pStyle w:val="IntenseQuote"/>
-      </w:pPr>
-      <w:r>
-        <w:rPr>
-          <w:rFonts w:ascii="Courier New" w:hAnsi="Courier New"/>
-          <w:sz w:val="20"/>
-        </w:rPr>
-        <w:t># 3. Confusion Matrix Heatmaps</w:t>
-        <w:br/>
-        <w:t>fig, axes = plt.subplots(1, 2, figsize=(12, 5))</w:t>
-        <w:br/>
-        <w:br/>
-        <w:t xml:space="preserve">sns.heatmap(confusion_matrix(y_test, nb_pred), annot=True, fmt='d', cmap='Blues', </w:t>
-        <w:br/>
-        <w:t xml:space="preserve">            ax=axes[0], xticklabels=data.target_names, yticklabels=data.target_names)</w:t>
-        <w:br/>
-        <w:t>axes[0].set_title('Naïve Bayes Confusion Matrix')</w:t>
-        <w:br/>
-        <w:t>axes[0].set_xlabel('Predicted')</w:t>
-        <w:br/>
-        <w:t>axes[0].set_ylabel('Actual')</w:t>
-        <w:br/>
-        <w:br/>
-        <w:t xml:space="preserve">sns.heatmap(confusion_matrix(y_test, dt_pred), annot=True, fmt='d', cmap='Greens', </w:t>
-        <w:br/>
-        <w:t xml:space="preserve">            ax=axes[1], xticklabels=data.target_names, yticklabels=data.target_names)</w:t>
-        <w:br/>
-        <w:t>axes[1].set_title('Decision Tree Confusion Matrix')</w:t>
-        <w:br/>
-        <w:t>axes[1].set_xlabel('Predicted')</w:t>
-        <w:br/>
-        <w:t>axes[1].set_ylabel('Actual')</w:t>
-        <w:br/>
-        <w:t>plt.show()</w:t>
-      </w:r>
-    </w:p>
+    <w:tbl>
+      <w:tblPr>
+        <w:tblW w:type="auto" w:w="0"/>
+        <w:tblLook w:firstColumn="1" w:firstRow="1" w:lastColumn="0" w:lastRow="0" w:noHBand="0" w:noVBand="1" w:val="04A0"/>
+      </w:tblPr>
+      <w:tblGrid>
+        <w:gridCol w:w="8640"/>
+      </w:tblGrid>
+      <w:tr>
+        <w:tc>
+          <w:tcPr>
+            <w:tcW w:type="dxa" w:w="8640"/>
+            <w:shd w:val="clear" w:color="auto" w:fill="F7F7F7"/>
+          </w:tcPr>
+          <w:p>
+            <w:pPr>
+              <w:spacing w:before="120" w:after="120"/>
+            </w:pPr>
+            <w:r>
+              <w:rPr>
+                <w:rFonts w:ascii="Consolas" w:hAnsi="Consolas"/>
+                <w:sz w:val="19"/>
+              </w:rPr>
+              <w:t># 3. Confusion Matrix Heatmaps</w:t>
+              <w:br/>
+              <w:t>fig, axes = plt.subplots(1, 2, figsize=(12, 5))</w:t>
+              <w:br/>
+              <w:br/>
+              <w:t xml:space="preserve">sns.heatmap(confusion_matrix(y_test, nb_pred), annot=True, fmt='d', cmap='Blues', </w:t>
+              <w:br/>
+              <w:t xml:space="preserve">            ax=axes[0], xticklabels=data.target_names, yticklabels=data.target_names)</w:t>
+              <w:br/>
+              <w:t>axes[0].set_title('Naïve Bayes Confusion Matrix')</w:t>
+              <w:br/>
+              <w:t>axes[0].set_xlabel('Predicted')</w:t>
+              <w:br/>
+              <w:t>axes[0].set_ylabel('Actual')</w:t>
+              <w:br/>
+              <w:br/>
+              <w:t xml:space="preserve">sns.heatmap(confusion_matrix(y_test, dt_pred), annot=True, fmt='d', cmap='Greens', </w:t>
+              <w:br/>
+              <w:t xml:space="preserve">            ax=axes[1], xticklabels=data.target_names, yticklabels=data.target_names)</w:t>
+              <w:br/>
+              <w:t>axes[1].set_title('Decision Tree Confusion Matrix')</w:t>
+              <w:br/>
+              <w:t>axes[1].set_xlabel('Predicted')</w:t>
+              <w:br/>
+              <w:t>axes[1].set_ylabel('Actual')</w:t>
+              <w:br/>
+              <w:t>plt.show()</w:t>
+            </w:r>
+          </w:p>
+        </w:tc>
+      </w:tr>
+    </w:tbl>
     <w:p>
       <w:r>
         <w:t>------------------------------------------------</w:t>

</xml_diff>

<commit_message>
Enhance docx to include truncated colab-style outputs and figures
</commit_message>
<xml_diff>
--- a/Lab-05/ML LAB -5.docx
+++ b/Lab-05/ML LAB -5.docx
@@ -76,7 +76,7 @@
           </w:tcPr>
           <w:p>
             <w:pPr>
-              <w:spacing w:before="120" w:after="120"/>
+              <w:spacing w:before="120" w:after="40"/>
             </w:pPr>
             <w:r>
               <w:rPr>
@@ -121,6 +121,36 @@
       </w:tr>
     </w:tbl>
     <w:p>
+      <w:pPr>
+        <w:spacing w:after="160"/>
+        <w:ind w:left="144"/>
+      </w:pPr>
+      <w:r>
+        <w:rPr>
+          <w:rFonts w:ascii="Consolas" w:hAnsi="Consolas"/>
+          <w:color w:val="333333"/>
+          <w:sz w:val="18"/>
+        </w:rPr>
+        <w:t>mean radius  mean texture  mean perimeter  mean area  ...  target</w:t>
+        <w:br/>
+        <w:t>0        17.99         10.38          122.80     1001.0  ...       0</w:t>
+        <w:br/>
+        <w:t>1        20.57         17.77          132.90     1326.0  ...       0</w:t>
+        <w:br/>
+        <w:t>...</w:t>
+        <w:br/>
+        <w:t>&lt;class 'pandas.core.frame.DataFrame'&gt;</w:t>
+        <w:br/>
+        <w:t>RangeIndex: 569 entries, 0 to 568</w:t>
+        <w:br/>
+        <w:t>Columns: 31 entries, mean radius to target</w:t>
+        <w:br/>
+        <w:t>dtypes: float64(30), int64(1)</w:t>
+        <w:br/>
+        <w:t>memory usage: 137.9 KB</w:t>
+      </w:r>
+    </w:p>
+    <w:p>
       <w:r>
         <w:br/>
         <w:t>b) Split the dataset into training and testing sets (80:20).</w:t>
@@ -142,7 +172,7 @@
           </w:tcPr>
           <w:p>
             <w:pPr>
-              <w:spacing w:before="120" w:after="120"/>
+              <w:spacing w:before="120" w:after="40"/>
             </w:pPr>
             <w:r>
               <w:rPr>
@@ -172,6 +202,22 @@
       </w:tr>
     </w:tbl>
     <w:p>
+      <w:pPr>
+        <w:spacing w:after="160"/>
+        <w:ind w:left="144"/>
+      </w:pPr>
+      <w:r>
+        <w:rPr>
+          <w:rFonts w:ascii="Consolas" w:hAnsi="Consolas"/>
+          <w:color w:val="333333"/>
+          <w:sz w:val="18"/>
+        </w:rPr>
+        <w:t>Training Data Shape: (455, 30)</w:t>
+        <w:br/>
+        <w:t>Testing Data Shape: (114, 30)</w:t>
+      </w:r>
+    </w:p>
+    <w:p>
       <w:r>
         <w:br/>
         <w:t>c) Train a Naïve Bayes classifier.</w:t>
@@ -193,7 +239,7 @@
           </w:tcPr>
           <w:p>
             <w:pPr>
-              <w:spacing w:before="120" w:after="120"/>
+              <w:spacing w:before="120" w:after="40"/>
             </w:pPr>
             <w:r>
               <w:rPr>
@@ -210,6 +256,20 @@
         </w:tc>
       </w:tr>
     </w:tbl>
+    <w:p>
+      <w:pPr>
+        <w:spacing w:after="160"/>
+        <w:ind w:left="144"/>
+      </w:pPr>
+      <w:r>
+        <w:rPr>
+          <w:rFonts w:ascii="Consolas" w:hAnsi="Consolas"/>
+          <w:color w:val="333333"/>
+          <w:sz w:val="18"/>
+        </w:rPr>
+        <w:t>GaussianNB()</w:t>
+      </w:r>
+    </w:p>
     <w:p>
       <w:r>
         <w:br/>
@@ -232,7 +292,7 @@
           </w:tcPr>
           <w:p>
             <w:pPr>
-              <w:spacing w:before="120" w:after="120"/>
+              <w:spacing w:before="120" w:after="40"/>
             </w:pPr>
             <w:r>
               <w:rPr>
@@ -283,7 +343,7 @@
           </w:tcPr>
           <w:p>
             <w:pPr>
-              <w:spacing w:before="120" w:after="120"/>
+              <w:spacing w:before="120" w:after="40"/>
             </w:pPr>
             <w:r>
               <w:rPr>
@@ -325,6 +385,78 @@
       </w:tr>
     </w:tbl>
     <w:p>
+      <w:pPr>
+        <w:spacing w:after="160"/>
+        <w:ind w:left="144"/>
+      </w:pPr>
+      <w:r>
+        <w:rPr>
+          <w:rFonts w:ascii="Consolas" w:hAnsi="Consolas"/>
+          <w:color w:val="333333"/>
+          <w:sz w:val="18"/>
+        </w:rPr>
+        <w:t>Naïve Bayes Accuracy: 0.9737</w:t>
+        <w:br/>
+        <w:br/>
+        <w:t>Confusion Matrix:</w:t>
+        <w:br/>
+        <w:t xml:space="preserve"> [[40  3]</w:t>
+        <w:br/>
+        <w:t xml:space="preserve"> [ 0 71]]</w:t>
+        <w:br/>
+        <w:br/>
+        <w:t>Classification Report:</w:t>
+        <w:br/>
+        <w:t xml:space="preserve">               precision    recall  f1-score   support</w:t>
+        <w:br/>
+        <w:br/>
+        <w:t xml:space="preserve">   malignant       1.00      0.93      0.96        43</w:t>
+        <w:br/>
+        <w:t xml:space="preserve">      benign       0.96      1.00      0.98        71</w:t>
+        <w:br/>
+        <w:br/>
+        <w:t xml:space="preserve">    accuracy                           0.97       114</w:t>
+        <w:br/>
+        <w:t xml:space="preserve">   ...</w:t>
+      </w:r>
+    </w:p>
+    <w:p>
+      <w:r>
+        <w:drawing>
+          <wp:inline xmlns:a="http://schemas.openxmlformats.org/drawingml/2006/main" xmlns:pic="http://schemas.openxmlformats.org/drawingml/2006/picture">
+            <wp:extent cx="3200400" cy="1498195"/>
+            <wp:docPr id="1" name="Picture 1"/>
+            <wp:cNvGraphicFramePr>
+              <a:graphicFrameLocks noChangeAspect="1"/>
+            </wp:cNvGraphicFramePr>
+            <a:graphic>
+              <a:graphicData uri="http://schemas.openxmlformats.org/drawingml/2006/picture">
+                <pic:pic>
+                  <pic:nvPicPr>
+                    <pic:cNvPr id="0" name="confusion_matrix_nb.png"/>
+                    <pic:cNvPicPr/>
+                  </pic:nvPicPr>
+                  <pic:blipFill>
+                    <a:blip r:embed="rId9"/>
+                    <a:stretch>
+                      <a:fillRect/>
+                    </a:stretch>
+                  </pic:blipFill>
+                  <pic:spPr>
+                    <a:xfrm>
+                      <a:off x="0" y="0"/>
+                      <a:ext cx="3200400" cy="1498195"/>
+                    </a:xfrm>
+                    <a:prstGeom prst="rect"/>
+                  </pic:spPr>
+                </pic:pic>
+              </a:graphicData>
+            </a:graphic>
+          </wp:inline>
+        </w:drawing>
+      </w:r>
+    </w:p>
+    <w:p>
       <w:r>
         <w:t>------------------------------------------------</w:t>
       </w:r>
@@ -359,7 +491,7 @@
           </w:tcPr>
           <w:p>
             <w:pPr>
-              <w:spacing w:before="120" w:after="120"/>
+              <w:spacing w:before="120" w:after="40"/>
             </w:pPr>
             <w:r>
               <w:rPr>
@@ -398,7 +530,7 @@
           </w:tcPr>
           <w:p>
             <w:pPr>
-              <w:spacing w:before="120" w:after="120"/>
+              <w:spacing w:before="120" w:after="40"/>
             </w:pPr>
             <w:r>
               <w:rPr>
@@ -435,7 +567,7 @@
           </w:tcPr>
           <w:p>
             <w:pPr>
-              <w:spacing w:before="120" w:after="120"/>
+              <w:spacing w:before="120" w:after="40"/>
             </w:pPr>
             <w:r>
               <w:rPr>
@@ -452,6 +584,20 @@
         </w:tc>
       </w:tr>
     </w:tbl>
+    <w:p>
+      <w:pPr>
+        <w:spacing w:after="160"/>
+        <w:ind w:left="144"/>
+      </w:pPr>
+      <w:r>
+        <w:rPr>
+          <w:rFonts w:ascii="Consolas" w:hAnsi="Consolas"/>
+          <w:color w:val="333333"/>
+          <w:sz w:val="18"/>
+        </w:rPr>
+        <w:t>DecisionTreeClassifier(random_state=42)</w:t>
+      </w:r>
+    </w:p>
     <w:p>
       <w:r>
         <w:br/>
@@ -474,7 +620,7 @@
           </w:tcPr>
           <w:p>
             <w:pPr>
-              <w:spacing w:before="120" w:after="120"/>
+              <w:spacing w:before="120" w:after="40"/>
             </w:pPr>
             <w:r>
               <w:rPr>
@@ -522,7 +668,7 @@
           </w:tcPr>
           <w:p>
             <w:pPr>
-              <w:spacing w:before="120" w:after="120"/>
+              <w:spacing w:before="120" w:after="40"/>
             </w:pPr>
             <w:r>
               <w:rPr>
@@ -564,6 +710,75 @@
       </w:tr>
     </w:tbl>
     <w:p>
+      <w:pPr>
+        <w:spacing w:after="160"/>
+        <w:ind w:left="144"/>
+      </w:pPr>
+      <w:r>
+        <w:rPr>
+          <w:rFonts w:ascii="Consolas" w:hAnsi="Consolas"/>
+          <w:color w:val="333333"/>
+          <w:sz w:val="18"/>
+        </w:rPr>
+        <w:t>Decision Tree Accuracy: 0.9474</w:t>
+        <w:br/>
+        <w:br/>
+        <w:t>Confusion Matrix:</w:t>
+        <w:br/>
+        <w:t xml:space="preserve"> [[39  4]</w:t>
+        <w:br/>
+        <w:t xml:space="preserve"> [ 2 69]]</w:t>
+        <w:br/>
+        <w:br/>
+        <w:t>Classification Report:</w:t>
+        <w:br/>
+        <w:t xml:space="preserve">               precision    recall  f1-score   support</w:t>
+        <w:br/>
+        <w:br/>
+        <w:t xml:space="preserve">   malignant       0.95      0.91      0.93        43</w:t>
+        <w:br/>
+        <w:t xml:space="preserve">      benign       0.95      0.97      0.96        71</w:t>
+        <w:br/>
+        <w:t>...</w:t>
+      </w:r>
+    </w:p>
+    <w:p>
+      <w:r>
+        <w:drawing>
+          <wp:inline xmlns:a="http://schemas.openxmlformats.org/drawingml/2006/main" xmlns:pic="http://schemas.openxmlformats.org/drawingml/2006/picture">
+            <wp:extent cx="3200400" cy="1541176"/>
+            <wp:docPr id="2" name="Picture 2"/>
+            <wp:cNvGraphicFramePr>
+              <a:graphicFrameLocks noChangeAspect="1"/>
+            </wp:cNvGraphicFramePr>
+            <a:graphic>
+              <a:graphicData uri="http://schemas.openxmlformats.org/drawingml/2006/picture">
+                <pic:pic>
+                  <pic:nvPicPr>
+                    <pic:cNvPr id="0" name="confusion_matrix_dt.png"/>
+                    <pic:cNvPicPr/>
+                  </pic:nvPicPr>
+                  <pic:blipFill>
+                    <a:blip r:embed="rId10"/>
+                    <a:stretch>
+                      <a:fillRect/>
+                    </a:stretch>
+                  </pic:blipFill>
+                  <pic:spPr>
+                    <a:xfrm>
+                      <a:off x="0" y="0"/>
+                      <a:ext cx="3200400" cy="1541176"/>
+                    </a:xfrm>
+                    <a:prstGeom prst="rect"/>
+                  </pic:spPr>
+                </pic:pic>
+              </a:graphicData>
+            </a:graphic>
+          </wp:inline>
+        </w:drawing>
+      </w:r>
+    </w:p>
+    <w:p>
       <w:r>
         <w:br/>
         <w:t>f) Visualize the decision tree.</w:t>
@@ -585,7 +800,7 @@
           </w:tcPr>
           <w:p>
             <w:pPr>
-              <w:spacing w:before="120" w:after="120"/>
+              <w:spacing w:before="120" w:after="40"/>
             </w:pPr>
             <w:r>
               <w:rPr>
@@ -620,6 +835,42 @@
         </w:tc>
       </w:tr>
     </w:tbl>
+    <w:p>
+      <w:r>
+        <w:drawing>
+          <wp:inline xmlns:a="http://schemas.openxmlformats.org/drawingml/2006/main" xmlns:pic="http://schemas.openxmlformats.org/drawingml/2006/picture">
+            <wp:extent cx="5486400" cy="2837552"/>
+            <wp:docPr id="3" name="Picture 3"/>
+            <wp:cNvGraphicFramePr>
+              <a:graphicFrameLocks noChangeAspect="1"/>
+            </wp:cNvGraphicFramePr>
+            <a:graphic>
+              <a:graphicData uri="http://schemas.openxmlformats.org/drawingml/2006/picture">
+                <pic:pic>
+                  <pic:nvPicPr>
+                    <pic:cNvPr id="0" name="decision_tree.png"/>
+                    <pic:cNvPicPr/>
+                  </pic:nvPicPr>
+                  <pic:blipFill>
+                    <a:blip r:embed="rId11"/>
+                    <a:stretch>
+                      <a:fillRect/>
+                    </a:stretch>
+                  </pic:blipFill>
+                  <pic:spPr>
+                    <a:xfrm>
+                      <a:off x="0" y="0"/>
+                      <a:ext cx="5486400" cy="2837552"/>
+                    </a:xfrm>
+                    <a:prstGeom prst="rect"/>
+                  </pic:spPr>
+                </pic:pic>
+              </a:graphicData>
+            </a:graphic>
+          </wp:inline>
+        </w:drawing>
+      </w:r>
+    </w:p>
     <w:p>
       <w:r>
         <w:t>------------------------------------------------</w:t>
@@ -661,7 +912,7 @@
           </w:tcPr>
           <w:p>
             <w:pPr>
-              <w:spacing w:before="120" w:after="120"/>
+              <w:spacing w:before="120" w:after="40"/>
             </w:pPr>
             <w:r>
               <w:rPr>
@@ -707,6 +958,42 @@
     </w:tbl>
     <w:p>
       <w:r>
+        <w:drawing>
+          <wp:inline xmlns:a="http://schemas.openxmlformats.org/drawingml/2006/main" xmlns:pic="http://schemas.openxmlformats.org/drawingml/2006/picture">
+            <wp:extent cx="4114800" cy="3144160"/>
+            <wp:docPr id="4" name="Picture 4"/>
+            <wp:cNvGraphicFramePr>
+              <a:graphicFrameLocks noChangeAspect="1"/>
+            </wp:cNvGraphicFramePr>
+            <a:graphic>
+              <a:graphicData uri="http://schemas.openxmlformats.org/drawingml/2006/picture">
+                <pic:pic>
+                  <pic:nvPicPr>
+                    <pic:cNvPr id="0" name="accuracy_comparison.png"/>
+                    <pic:cNvPicPr/>
+                  </pic:nvPicPr>
+                  <pic:blipFill>
+                    <a:blip r:embed="rId12"/>
+                    <a:stretch>
+                      <a:fillRect/>
+                    </a:stretch>
+                  </pic:blipFill>
+                  <pic:spPr>
+                    <a:xfrm>
+                      <a:off x="0" y="0"/>
+                      <a:ext cx="4114800" cy="3144160"/>
+                    </a:xfrm>
+                    <a:prstGeom prst="rect"/>
+                  </pic:spPr>
+                </pic:pic>
+              </a:graphicData>
+            </a:graphic>
+          </wp:inline>
+        </w:drawing>
+      </w:r>
+    </w:p>
+    <w:p>
+      <w:r>
         <w:br/>
         <w:t>2) ROC curve comparison</w:t>
       </w:r>
@@ -727,7 +1014,7 @@
           </w:tcPr>
           <w:p>
             <w:pPr>
-              <w:spacing w:before="120" w:after="120"/>
+              <w:spacing w:before="120" w:after="40"/>
             </w:pPr>
             <w:r>
               <w:rPr>
@@ -770,6 +1057,42 @@
     </w:tbl>
     <w:p>
       <w:r>
+        <w:drawing>
+          <wp:inline xmlns:a="http://schemas.openxmlformats.org/drawingml/2006/main" xmlns:pic="http://schemas.openxmlformats.org/drawingml/2006/picture">
+            <wp:extent cx="4114800" cy="3257302"/>
+            <wp:docPr id="5" name="Picture 5"/>
+            <wp:cNvGraphicFramePr>
+              <a:graphicFrameLocks noChangeAspect="1"/>
+            </wp:cNvGraphicFramePr>
+            <a:graphic>
+              <a:graphicData uri="http://schemas.openxmlformats.org/drawingml/2006/picture">
+                <pic:pic>
+                  <pic:nvPicPr>
+                    <pic:cNvPr id="0" name="roc_curve.png"/>
+                    <pic:cNvPicPr/>
+                  </pic:nvPicPr>
+                  <pic:blipFill>
+                    <a:blip r:embed="rId13"/>
+                    <a:stretch>
+                      <a:fillRect/>
+                    </a:stretch>
+                  </pic:blipFill>
+                  <pic:spPr>
+                    <a:xfrm>
+                      <a:off x="0" y="0"/>
+                      <a:ext cx="4114800" cy="3257302"/>
+                    </a:xfrm>
+                    <a:prstGeom prst="rect"/>
+                  </pic:spPr>
+                </pic:pic>
+              </a:graphicData>
+            </a:graphic>
+          </wp:inline>
+        </w:drawing>
+      </w:r>
+    </w:p>
+    <w:p>
+      <w:r>
         <w:br/>
         <w:t>3) Confusion Matrix heatmaps for both models</w:t>
       </w:r>
@@ -790,7 +1113,7 @@
           </w:tcPr>
           <w:p>
             <w:pPr>
-              <w:spacing w:before="120" w:after="120"/>
+              <w:spacing w:before="120" w:after="40"/>
             </w:pPr>
             <w:r>
               <w:rPr>
@@ -829,6 +1152,20 @@
         </w:tc>
       </w:tr>
     </w:tbl>
+    <w:p>
+      <w:pPr>
+        <w:spacing w:after="160"/>
+        <w:ind w:left="144"/>
+      </w:pPr>
+      <w:r>
+        <w:rPr>
+          <w:rFonts w:ascii="Consolas" w:hAnsi="Consolas"/>
+          <w:color w:val="333333"/>
+          <w:sz w:val="18"/>
+        </w:rPr>
+        <w:t>&lt;AxesSubplot:title={'center':'Decision Tree Confusion Matrix'}, xlabel='Predicted', ylabel='Actual'&gt;</w:t>
+      </w:r>
+    </w:p>
     <w:p>
       <w:r>
         <w:t>------------------------------------------------</w:t>

</xml_diff>